<commit_message>
Add mic-based voice input (STT) and adopt clone-voice-client SDK; update thesis
- Add POST /voice/transcribe route + mic button in chat UI, wired to
  clone-voice-station's new STT endpoint (PhoWhisper via Colab, local Whisper
  fallback)
- Replace voice/station_client.py's standalone HTTP client with a thin adapter
  over the installable clone-voice-client SDK (sibling project)
- Strengthen the voice consent screen: biometric-data classification, Google
  Colab cross-border transfer disclosure, and the new spoken AI-disclosure
  behavior (Vietnam PDPL 91/2025/QH15, AI Law 134/2025/QH15)
- Rewrite thesis architecture/technology/legal sections to match the real
  two-service split (clone-voice-station + clone-voice-client SDK), add a
  Legal and Ethical Considerations section, correct the zero-shot baseline to
  F5-TTS-Vietnamese-ViVoice, fix dangling reference numbering

Co-Authored-By: Claude Sonnet 5 <noreply@anthropic.com>
</commit_message>
<xml_diff>
--- a/Thesis_bao24mse23204 (1).docx
+++ b/Thesis_bao24mse23204 (1).docx
@@ -1214,7 +1214,7 @@
           <w:sz w:val="24"/>
           <w:szCs w:val="24"/>
         </w:rPr>
-        <w:t xml:space="preserve">This thesis proposes the integration of speech-based interaction into an existing Retrieval-Augmented Generation (RAG) legal assistant for Vietnamese enterprise law. While the current system effectively retrieves and generates answers using a vector database, </w:t>
+        <w:t>This thesis integrates bidirectional voice interaction into an existing Retrieval-Augmented Generation (RAG) legal assistant for Vietnamese enterprise law, which otherwise retrieves and generates answers through a vector database, embedding model, and large language model but is limited to text-only interaction. Speech input is handled by PhoWhisper, a Vietnamese fine-tune of OpenAI Whisper, with a local Whisper model kept as an offline fallback; speech output combines Edge-TTS (with an F5-TTS-Vietnamese-ViVoice zero-shot baseline) with a Retrieval-based Voice Conversion (RVC) model trained per user on Google Colab, producing a personalised voice response. Rather than embedding this functionality inside the assistant itself, the voice loop is implemented as clone-voice-station, an independent, API-key-authenticated service consumed over HTTP through an installable client SDK (clone-voice-client) — a stricter test of the modularity claim than an embedded module would be, since the RAG pipeline is provably untouched by construction rather than by convention. rag-legal-assistant serves as the reference integration demonstrating this pattern, and the service/SDK split is designed so any other AI assistant could adopt the same voice loop without modification. The work also addresses two Vietnamese legal frameworks that took effect during this thesis — the Law on Personal Data Protection (91/2025/QH15) and the Law on Artificial Intelligence (134/2025/QH15) — through explicit consent for biometric voice data and a mandatory spoken AI-disclosure notice with a provenance watermark on every voice-converted response. The system is evaluated using objective metrics (latency, Word Error Rate, signal-to-noise ratio) and subjective measures (Mean Opinion Score for naturalness and speaker similarity) against the zero-shot baseline, with ASR domain fine-tuning scoped as future work.</w:t>
       </w:r>
       <w:r>
         <w:rPr>
@@ -1224,7 +1224,6 @@
           <w:szCs w:val="24"/>
           <w:lang w:val="en-US"/>
         </w:rPr>
-        <w:t>embedding</w:t>
       </w:r>
       <w:r>
         <w:rPr>
@@ -1233,7 +1232,6 @@
           <w:sz w:val="24"/>
           <w:szCs w:val="24"/>
         </w:rPr>
-        <w:t>, and a large language model, it is limited to text-based interaction, which reduces usability and accessibility. To address this limitation, the study introduces a bidirectional voice interface by incorporating Automatic Speech Recognition (ASR) and Retrieval-based Voice Conversion (RVC). The proposed system utilizes Whisper for speech-to-text, Edge-TTS for base speech synthesis, and an RVC model trained on Google Colab to generate personalized voice output. The integration is designed to be modular and does not modify the existing RAG pipeline. The system is evaluated using both objective metrics, including latency and word error rate, and subjective measures such as Mean Opinion Score for naturalness and speaker similarity. Results are expected to demonstrate improved usability and more natural human-computer interaction.</w:t>
       </w:r>
     </w:p>
     <w:p>
@@ -2315,49 +2313,33 @@
         <w:rPr>
           <w:rFonts w:hint="default" w:ascii="Times New Roman" w:hAnsi="Times New Roman" w:cs="Times New Roman"/>
         </w:rPr>
-        <w:fldChar w:fldCharType="begin"/>
-      </w:r>
-      <w:r>
-        <w:rPr>
-          <w:rFonts w:hint="default" w:ascii="Times New Roman" w:hAnsi="Times New Roman" w:cs="Times New Roman"/>
-        </w:rPr>
-        <w:instrText xml:space="preserve"> HYPERLINK \l _Toc19647 </w:instrText>
-      </w:r>
-      <w:r>
-        <w:rPr>
-          <w:rFonts w:hint="default" w:ascii="Times New Roman" w:hAnsi="Times New Roman" w:cs="Times New Roman"/>
-        </w:rPr>
-        <w:fldChar w:fldCharType="separate"/>
-      </w:r>
-      <w:r>
-        <w:rPr>
-          <w:rFonts w:hint="default" w:ascii="Times New Roman" w:hAnsi="Times New Roman" w:cs="Times New Roman"/>
-        </w:rPr>
-        <w:t>3.3 Technology and Tools</w:t>
-      </w:r>
-      <w:r>
-        <w:tab/>
-      </w:r>
-      <w:r>
-        <w:fldChar w:fldCharType="begin"/>
-      </w:r>
-      <w:r>
-        <w:instrText xml:space="preserve"> PAGEREF _Toc19647 \h </w:instrText>
-      </w:r>
-      <w:r>
-        <w:fldChar w:fldCharType="separate"/>
-      </w:r>
-      <w:r>
-        <w:t>14</w:t>
-      </w:r>
-      <w:r>
-        <w:fldChar w:fldCharType="end"/>
-      </w:r>
-      <w:r>
-        <w:rPr>
-          <w:rFonts w:hint="default" w:ascii="Times New Roman" w:hAnsi="Times New Roman" w:cs="Times New Roman"/>
-        </w:rPr>
-        <w:fldChar w:fldCharType="end"/>
+        <w:t>3.4 Technology and Tools</w:t>
+      </w:r>
+      <w:r>
+        <w:rPr>
+          <w:rFonts w:hint="default" w:ascii="Times New Roman" w:hAnsi="Times New Roman" w:cs="Times New Roman"/>
+        </w:rPr>
+      </w:r>
+      <w:r>
+        <w:rPr>
+          <w:rFonts w:hint="default" w:ascii="Times New Roman" w:hAnsi="Times New Roman" w:cs="Times New Roman"/>
+        </w:rPr>
+      </w:r>
+      <w:r>
+        <w:rPr>
+          <w:rFonts w:hint="default" w:ascii="Times New Roman" w:hAnsi="Times New Roman" w:cs="Times New Roman"/>
+        </w:rPr>
+      </w:r>
+      <w:r/>
+      <w:r/>
+      <w:r/>
+      <w:r/>
+      <w:r/>
+      <w:r/>
+      <w:r>
+        <w:rPr>
+          <w:rFonts w:hint="default" w:ascii="Times New Roman" w:hAnsi="Times New Roman" w:cs="Times New Roman"/>
+        </w:rPr>
       </w:r>
     </w:p>
     <w:p>
@@ -5300,7 +5282,7 @@
           <w:rFonts w:hint="default" w:ascii="Times New Roman" w:hAnsi="Times New Roman" w:cs="Times New Roman"/>
           <w:sz w:val="24"/>
         </w:rPr>
-        <w:t>Integrate a speech-to-text module (Whisper) into the existing RAG legal assistant so that users can ask questions by voice in Vietnamese.</w:t>
+        <w:t>Integrate a speech-to-text module (PhoWhisper, with a local Whisper fallback) into the existing RAG legal assistant so that users can ask questions by voice in Vietnamese.</w:t>
       </w:r>
     </w:p>
     <w:p>
@@ -5332,7 +5314,7 @@
           <w:rFonts w:hint="default" w:ascii="Times New Roman" w:hAnsi="Times New Roman" w:cs="Times New Roman"/>
           <w:sz w:val="24"/>
         </w:rPr>
-        <w:t>Compare the proposed TTS + RVC pipeline against modern zero-shot voice-cloning alternatives (XTTS-v2, OpenVoice) in terms of naturalness, latency, and engineering cost.</w:t>
+        <w:t>Compare the proposed TTS + RVC pipeline against a modern zero-shot voice-cloning baseline (F5-TTS-Vietnamese-ViVoice, with XTTS-v2 and OpenVoice reviewed as alternatives) in terms of naturalness, latency, and engineering cost.</w:t>
       </w:r>
     </w:p>
     <w:p>
@@ -5398,7 +5380,7 @@
           <w:rFonts w:hint="default" w:ascii="Times New Roman" w:hAnsi="Times New Roman" w:cs="Times New Roman"/>
           <w:sz w:val="24"/>
         </w:rPr>
-        <w:t>RQ2 — Under the same Vietnamese legal-domain test set, does TTS + RVC outperform a zero-shot voice-cloning baseline (XTTS-v2) in MOS naturalness and target-speaker similarity?</w:t>
+        <w:t>RQ2 — Under the same Vietnamese legal-domain test set, does TTS + RVC outperform a zero-shot voice-cloning baseline (F5-TTS-Vietnamese-ViVoice) in MOS naturalness and target-speaker similarity?</w:t>
       </w:r>
     </w:p>
     <w:p>
@@ -5449,7 +5431,7 @@
           <w:i w:val="0"/>
           <w:sz w:val="24"/>
         </w:rPr>
-        <w:t>The scope is limited to integrating voice modalities into an existing assistant. The thesis does not propose new neural-network architectures, does not rebuild the RAG retrieval pipeline, and does not target multilingual coverage beyond Vietnamese and English. The implementation is delivered as a research prototype demonstrated on the current rag-legal-assistant code</w:t>
+        <w:t>The scope is limited to integrating voice modalities into an existing assistant. The thesis does not propose new neural-network architectures, does not rebuild the RAG retrieval pipeline, and does not target multilingual coverage beyond Vietnamese and English. The implementation is delivered as two companion projects: clone-voice-station, an independent voice (STT/TTS/RVC) service usable by any AI assistant, distributed together with an installable client SDK (clone-voice-client); and rag-legal-assistant, the existing RAG legal assistant used as the reference integration demonstrating the pattern end-to-end. Two RVC models will be trained for evaluation, and the resulting prototype will be benchmarked against one zero-shot baseline (F5-TTS-Vietnamese-ViVoice). Domain-specific fine-tuning of the ASR model is intentionally left as future work — see Section 7.</w:t>
       </w:r>
       <w:r>
         <w:rPr>
@@ -5459,7 +5441,6 @@
           <w:sz w:val="24"/>
           <w:lang w:val="en-US"/>
         </w:rPr>
-        <w:t xml:space="preserve"> </w:t>
       </w:r>
       <w:r>
         <w:rPr>
@@ -5468,7 +5449,6 @@
           <w:i w:val="0"/>
           <w:sz w:val="24"/>
         </w:rPr>
-        <w:t xml:space="preserve">base. Two RVC models will be trained for evaluation, and the resulting prototype will be </w:t>
       </w:r>
       <w:r>
         <w:rPr>
@@ -5478,7 +5458,6 @@
           <w:sz w:val="24"/>
           <w:lang w:val="en-US"/>
         </w:rPr>
-        <w:t>benchmark</w:t>
       </w:r>
       <w:r>
         <w:rPr>
@@ -5487,7 +5466,6 @@
           <w:i w:val="0"/>
           <w:sz w:val="24"/>
         </w:rPr>
-        <w:t xml:space="preserve"> against one zero-shot baseline (XTTS-v2).</w:t>
       </w:r>
     </w:p>
     <w:p>
@@ -5617,7 +5595,7 @@
           <w:i w:val="0"/>
           <w:sz w:val="24"/>
         </w:rPr>
-        <w:t>The response-generation step is performed by Meta's Llama-3.1-8B [10], deployed through the Groq inference platform for low-latency completion. RAG [3] augments the LLM by retrieving the top-k most similar legal documents (using BGE embeddings [11] over a ChromaDB vector store) and concatenating them into the LLM prompt. This thesis treats the LLM and RAG as two independently measurable components: RAG controls grounding quality (does the LLM see the right document?), while the LLM controls response quality and dominates inference latency.</w:t>
+        <w:t>The response-generation step is performed by Meta's Llama-3.1-8B [9], deployed through the Groq inference platform for low-latency completion. RAG [3] augments the LLM by retrieving the top-k most similar legal documents (using BGE embeddings [10] over a ChromaDB vector store) and concatenating them into the LLM prompt. This thesis treats the LLM and RAG as two independently measurable components: RAG controls grounding quality (does the LLM see the right document?), while the LLM controls response quality and dominates inference latency.</w:t>
       </w:r>
     </w:p>
     <w:p>
@@ -5751,7 +5729,7 @@
           <w:rFonts w:hint="default" w:ascii="Times New Roman" w:hAnsi="Times New Roman" w:cs="Times New Roman"/>
           <w:sz w:val="24"/>
         </w:rPr>
-        <w:t>Zero-shot voice cloning models such as XTTS-v2 [7] and OpenVoice [8] generate the target voice directly from a 6–10 second reference clip, with no per-speaker training. They trade some target-speaker fidelity for a much simpler engineering pipeline.</w:t>
+        <w:t>Zero-shot voice cloning models such as XTTS-v2 [7] and OpenVoice [8] generate the target voice directly from a 6–10 second reference clip, with no per-speaker training. They trade some target-speaker fidelity for a much simpler engineering pipeline. A Vietnamese-specific instance of this family, F5-TTS-Vietnamese-ViVoice [11], fine-tunes the flow-matching F5-TTS model [12] on the ViVoice corpus and is the zero-shot baseline actually deployed in this work, since a Vietnamese-tuned baseline is a fairer comparison than a multilingual one on a Vietnamese-only test set.</w:t>
       </w:r>
     </w:p>
     <w:p>
@@ -5806,7 +5784,7 @@
           <w:i w:val="0"/>
           <w:sz w:val="24"/>
         </w:rPr>
-        <w:t xml:space="preserve">Table 1 </w:t>
+        <w:t>Table 2 summarizes the trade-offs that motivate the hybrid design used in this thesis: RVC as the primary voice path (best timbre when reference data is available) and F5-TTS-Vietnamese-ViVoice as a baseline for evaluation.</w:t>
       </w:r>
       <w:r>
         <w:rPr>
@@ -5816,7 +5794,6 @@
           <w:sz w:val="24"/>
           <w:lang w:val="en-US"/>
         </w:rPr>
-        <w:t>summarize</w:t>
       </w:r>
       <w:r>
         <w:rPr>
@@ -5825,7 +5802,6 @@
           <w:i w:val="0"/>
           <w:sz w:val="24"/>
         </w:rPr>
-        <w:t xml:space="preserve"> the trade-offs that motivate the hybrid design used in this thesis: RVC as the primary voice path (best timbre when reference data is available) and XTTS-v2 as a baseline for evaluation.</w:t>
       </w:r>
     </w:p>
     <w:tbl>
@@ -6007,7 +5983,7 @@
                 <w:sz w:val="24"/>
                 <w:szCs w:val="24"/>
               </w:rPr>
-              <w:t>XTTS-v2 / OpenVoice</w:t>
+              <w:t>Zero-shot cloning (XTTS-v2, OpenVoice, F5-TTS)</w:t>
             </w:r>
           </w:p>
         </w:tc>
@@ -7005,7 +6981,7 @@
           <w:i w:val="0"/>
           <w:sz w:val="24"/>
         </w:rPr>
-        <w:t>The chosen stack Whisper + Llama-3.1 + edge-TTS + RVC is justified as follows. Whisper offers state-of-the-art Vietnamese ASR with no fine-tuning; this isolates the speech-recognition variable from the thesis contribution. Llama-3.1-8B served by Groq provides production-grade latency (typically 0.5–1.0 s for a 200-token completion), keeping the LLM out of the latency critical path. edge-TTS gives clean Vietnamese prosody as the source signal that RVC operates on — RVC requires its source audio to already match the target language. RVC v2 was selected over end-to-end zero-shot models (XTTS-v2, OpenVoice) because the per-speaker training step is itself an instructive contribution: the resulting comparison shows whether speaker-specific training yields a measurable quality gain over zero-shot cloning on the same Vietnamese legal speech, which is an open question in the recent literature. This combination therefore directly supports RQ2 and RQ3 stated in 1.2.</w:t>
+        <w:t>RVC v2 was selected over end-to-end zero-shot models (XTTS-v2, OpenVoice, and the Vietnamese-tuned F5-TTS-Vietnamese-ViVoice) because the per-speaker training step is itself an instructive contribution: the resulting comparison shows whether speaker-specific training yields a measurable quality gain over zero-shot cloning on the same Vietnamese legal speech, which is an open question in the recent literature. F5-TTS-Vietnamese-ViVoice was ultimately chosen as the deployed comparison baseline over the more commonly cited XTTS-v2, since a model already fine-tuned on Vietnamese speech (ViVoice) is a fairer opponent on a Vietnamese-only legal test set than a multilingual model evaluated out of its training distribution. This combination therefore directly supports RQ2 and RQ3 stated in 1.2.</w:t>
       </w:r>
     </w:p>
     <w:p>
@@ -7065,7 +7041,7 @@
           <w:i w:val="0"/>
           <w:sz w:val="24"/>
         </w:rPr>
-        <w:t xml:space="preserve">The proposed system extends the existing RAG legal assistant with a bidirectional voice loop. On the input side, the user records a question through the browser microphone; the audio is streamed to the server, transcribed by Whisper, and forwarded to the existing RAG pipeline unchanged. On the output side, the textual answer produced by the LLM is first converted to speech with edge-TTS (a Vietnamese neural TTS) and then re-voiced with the trained RVC model, producing a </w:t>
+        <w:t>The proposed system extends the existing RAG legal assistant with a bidirectional voice loop, implemented as a separate service rather than as code added to the assistant itself. On the input side, the user records a question through the browser microphone; the audio is sent to clone-voice-station, transcribed by PhoWhisper (or a local Whisper fallback), and the resulting text is forwarded to rag-legal-assistant's existing RAG pipeline unchanged. On the output side, the textual answer produced by the LLM is sent to clone-voice-station, where it is first converted to speech with edge-TTS (a Vietnamese neural TTS) and then re-voiced with the user's trained RVC model, producing a personalised answer streamed back to the browser as a WAV file — prefixed with a spoken AI-disclosure notice and tagged with a provenance watermark (Section 5). The voice features are opt-in: the user can disable them and the assistant degrades gracefully to text-only mode, and clone-voice-station itself degrades gracefully to plain TTS whenever the Colab-hosted RVC/PhoWhisper session is offline.</w:t>
       </w:r>
       <w:r>
         <w:rPr>
@@ -7075,7 +7051,6 @@
           <w:sz w:val="24"/>
           <w:lang w:val="en-US"/>
         </w:rPr>
-        <w:t>personalize</w:t>
       </w:r>
       <w:r>
         <w:rPr>
@@ -7084,7 +7059,6 @@
           <w:i w:val="0"/>
           <w:sz w:val="24"/>
         </w:rPr>
-        <w:t xml:space="preserve"> answer that is streamed back to the browser as a WAV file. The voice features are opt-in: the user can disable them and the assistant degrades gracefully to text-only mode.</w:t>
       </w:r>
     </w:p>
     <w:p>
@@ -7151,7 +7125,7 @@
           <w:rFonts w:hint="default" w:ascii="Times New Roman" w:hAnsi="Times New Roman" w:cs="Times New Roman"/>
           <w:sz w:val="24"/>
         </w:rPr>
-        <w:t>Stage 2 — ASR (Whisper / PhoWhisper) converts speech to Vietnamese text.</w:t>
+        <w:t>Stage 2 — ASR (PhoWhisper primary, local Whisper fallback) converts speech to Vietnamese text.</w:t>
       </w:r>
     </w:p>
     <w:p>
@@ -7265,7 +7239,7 @@
           <w:i w:val="0"/>
           <w:sz w:val="24"/>
         </w:rPr>
-        <w:t>Figure 1 is intentionally abstract: it shows the data flow at the logical level and surfaces the LLM and RAG as separate, measurable components. Figure 2 shows the same system at the implementation level — Flask routes, file paths, and concrete service boundaries.</w:t>
+        <w:t>Figure 1 is intentionally abstract: it shows the data flow at the logical level and surfaces the LLM and RAG as separate, measurable components. Figure 2 shows the same system at the implementation level — the FastAPI routes, the service boundary between rag-legal-assistant and clone-voice-station, and the HTTP/SDK contract between them.</w:t>
       </w:r>
     </w:p>
     <w:p>
@@ -7492,7 +7466,10 @@
           <w:i w:val="0"/>
           <w:sz w:val="24"/>
         </w:rPr>
-        <w:t>The implementation architecture follows the existing client-server design and adds three internal modules under a new voice/ package, plus two new HTTP endpoints (/voice/transcribe and /voice/speak) registered alongside the existing /get RAG endpoint. RVC inference is offloaded to a Google Colab GPU instance over a cloudflared tunnel, isolating the fairseq + torch dependency stack from the Python 3.12 web service. All other modules of the original assistant (engine/rag_engine.py, database/database.py, build_db.py, the login flow) remain untouched, which keeps the architectural change strictly additive and low-risk.</w:t>
+        <w:t>The final architecture is a stronger realization of the same design goal than the additive voice/ package originally proposed: rather than adding modules inside rag-legal-assistant, the voice functionality is implemented as clone-voice-station, an independently deployable FastAPI service with its own SQLite database, authenticated by a per-client API key. rag-legal-assistant integrates with it purely as an HTTP client — through clone-voice-client, an installable Python SDK that wraps every station endpoint (consent, profile management, sample upload, training, /api/transcribe, /api/speak) behind a single VoiceStationClient class, so that voice/station_client.py inside rag-legal-assistant is now a thin adapter rather than a duplicated implementation. Because the RAG pipeline (engine/rag_engine.py, database/database.py, the login flow) never imports voice code and the voice service never imports RAG code, RQ1's modularity claim is enforced by the process boundary itself rather than by code-review discipline: rag-legal-assistant could be deleted entirely and clone-voice-station — plus any other assistant that installs the SDK — would be unaffected, and vice versa.</w:t>
+        <w:br/>
+        <w:br/>
+        <w:t>Within clone-voice-station, RVC inference and PhoWhisper transcription are both offloaded to a Google Colab GPU instance over a cloudflared tunnel (colab/voice_server.ipynb), isolating the fairseq/torch/transformers dependency stack from the station's own lightweight FastAPI process; both calls degrade gracefully to a local fallback (unconverted TTS audio, or a local CPU-only Whisper model) whenever that Colab session is offline. The station is also multi-tenant by construction — every request is scoped by an API key identifying the calling client app plus an opaque external_user_id — not because this thesis targets multiple production deployments, but because supporting more than one caller from day one is what makes the SDK a genuine, testable integration point rather than a single-purpose extension of rag-legal-assistant alone. A manager dashboard lets an operator inspect and, if necessary, disable or delete any client's cloned voices, and a webhook/notification mechanism informs a client app when that happens.</w:t>
       </w:r>
     </w:p>
     <w:p>
@@ -7692,7 +7669,7 @@
           <w:color w:val="000000"/>
           <w:sz w:val="24"/>
         </w:rPr>
-        <w:t>3.3 Technology and Tools</w:t>
+        <w:t>3.4 Technology and Tools</w:t>
       </w:r>
       <w:bookmarkEnd w:id="22"/>
     </w:p>
@@ -7912,7 +7889,7 @@
                 <w:i w:val="0"/>
                 <w:sz w:val="22"/>
               </w:rPr>
-              <w:t>Flask 3, Werkzeug, vanilla JS, MediaRecorder, HTML5 &lt;audio&gt;</w:t>
+              <w:t>FastAPI, Starlette, Jinja2, vanilla JS, MediaRecorder, HTML5 &lt;audio&gt;</w:t>
             </w:r>
           </w:p>
         </w:tc>
@@ -8203,7 +8180,7 @@
                 <w:i w:val="0"/>
                 <w:sz w:val="22"/>
               </w:rPr>
-              <w:t>OpenAI Whisper (small) or VinAI PhoWhisper-small</w:t>
+              <w:t>VinAI PhoWhisper-large via Colab (primary), local OpenAI Whisper-small as offline fallback</w:t>
             </w:r>
           </w:p>
         </w:tc>
@@ -8518,7 +8495,7 @@
                 <w:i w:val="0"/>
                 <w:sz w:val="22"/>
               </w:rPr>
-              <w:t xml:space="preserve">Coqui XTTS-v2 </w:t>
+              <w:t>F5-TTS-Vietnamese-ViVoice (Vietnamese fine-tune of F5-TTS; RQ2 evaluation baseline, optionally selectable as an alternate base-voice engine)</w:t>
             </w:r>
           </w:p>
           <w:p>
@@ -8530,15 +8507,70 @@
                 <w:bCs/>
               </w:rPr>
             </w:pPr>
+            <w:r/>
+          </w:p>
+        </w:tc>
+      </w:tr>
+      <w:tr>
+        <w:tc>
+          <w:tcPr>
+            <w:tcW w:type="dxa" w:w="1778"/>
+          </w:tcPr>
+          <w:p>
             <w:r>
-              <w:rPr>
-                <w:rFonts w:hint="default" w:ascii="Times New Roman" w:hAnsi="Times New Roman" w:cs="Times New Roman"/>
-                <w:b w:val="0"/>
-                <w:bCs/>
-                <w:i w:val="0"/>
-                <w:sz w:val="22"/>
-              </w:rPr>
-              <w:t>(used only as evaluation baseline, not deployed)</w:t>
+              <w:t>Voice architecture</w:t>
+            </w:r>
+          </w:p>
+        </w:tc>
+        <w:tc>
+          <w:tcPr>
+            <w:tcW w:type="dxa" w:w="2352"/>
+          </w:tcPr>
+          <w:p>
+            <w:r>
+              <w:t>Service split + SDK</w:t>
+            </w:r>
+          </w:p>
+        </w:tc>
+        <w:tc>
+          <w:tcPr>
+            <w:tcW w:type="dxa" w:w="4704"/>
+          </w:tcPr>
+          <w:p>
+            <w:r>
+              <w:t>clone-voice-station (independent FastAPI service, SQLite, API-key auth) + clone-voice-client (installable Python SDK)</w:t>
+            </w:r>
+          </w:p>
+        </w:tc>
+      </w:tr>
+      <w:tr>
+        <w:tc>
+          <w:tcPr>
+            <w:tcW w:type="dxa" w:w="1778"/>
+          </w:tcPr>
+          <w:p>
+            <w:r>
+              <w:t>Compliance</w:t>
+            </w:r>
+          </w:p>
+        </w:tc>
+        <w:tc>
+          <w:tcPr>
+            <w:tcW w:type="dxa" w:w="2352"/>
+          </w:tcPr>
+          <w:p>
+            <w:r>
+              <w:t>AI-disclosure + watermark</w:t>
+            </w:r>
+          </w:p>
+        </w:tc>
+        <w:tc>
+          <w:tcPr>
+            <w:tcW w:type="dxa" w:w="4704"/>
+          </w:tcPr>
+          <w:p>
+            <w:r>
+              <w:t>pydub-based spoken disclosure prefix + WAV provenance tag (Law No. 134/2025/QH15)</w:t>
             </w:r>
           </w:p>
         </w:tc>
@@ -8664,7 +8696,7 @@
           <w:rFonts w:hint="default" w:ascii="Times New Roman" w:hAnsi="Times New Roman" w:cs="Times New Roman"/>
           <w:color w:val="auto"/>
         </w:rPr>
-        <w:t>4. Implementation Plan</w:t>
+        <w:t>4. Implementation Status</w:t>
       </w:r>
       <w:bookmarkEnd w:id="24"/>
     </w:p>
@@ -8682,7 +8714,7 @@
           <w:color w:val="000000"/>
           <w:sz w:val="24"/>
         </w:rPr>
-        <w:t>4.1 Main Development Stages</w:t>
+        <w:t>4.1 Development Stages and Current Status</w:t>
       </w:r>
       <w:bookmarkEnd w:id="25"/>
     </w:p>
@@ -8701,7 +8733,7 @@
           <w:i w:val="0"/>
           <w:sz w:val="24"/>
         </w:rPr>
-        <w:t>The work is organised into five stages over twelve weeks:</w:t>
+        <w:t>The work was organised into five stages; status at time of writing is noted per stage below.</w:t>
       </w:r>
     </w:p>
     <w:p>
@@ -8718,14 +8750,13 @@
           <w:b/>
           <w:sz w:val="24"/>
         </w:rPr>
-        <w:t xml:space="preserve">Stage 1 — Voice dataset preparation: </w:t>
+        <w:t>Stage 1 (done) — Voice dataset preparation: a fixed set of eight general-topic Vietnamese reading scripts (voice/scripts.py) and a browser recording flow (voice_profile.html) let a user record and upload samples; slicing/normalisation happens server-side during training.</w:t>
       </w:r>
       <w:r>
         <w:rPr>
           <w:rFonts w:hint="default" w:ascii="Times New Roman" w:hAnsi="Times New Roman" w:cs="Times New Roman"/>
           <w:sz w:val="24"/>
         </w:rPr>
-        <w:t>record/clean ~15 min of target-speaker speech, slice into 3–8 s segments, normalise to 16 kHz mono.</w:t>
       </w:r>
     </w:p>
     <w:p>
@@ -8742,14 +8773,13 @@
           <w:b/>
           <w:sz w:val="24"/>
         </w:rPr>
-        <w:t xml:space="preserve">Stage 2 — RVC training on Colab: </w:t>
+        <w:t>Stage 2 (done) — RVC training on Colab: colab/voice_server.ipynb implements the full pipeline (preprocess, F0 extraction with RMVPE, RVC v2 training, FAISS index build, export) behind a queue that serialises jobs onto the single available GPU.</w:t>
       </w:r>
       <w:r>
         <w:rPr>
           <w:rFonts w:hint="default" w:ascii="Times New Roman" w:hAnsi="Times New Roman" w:cs="Times New Roman"/>
           <w:sz w:val="24"/>
         </w:rPr>
-        <w:t>preprocess, F0 extraction with RMVPE, train RVC v2 for ~200 epochs, build the FAISS retrieval index, export .pth and .index.</w:t>
       </w:r>
     </w:p>
     <w:p>
@@ -8766,14 +8796,13 @@
           <w:b/>
           <w:sz w:val="24"/>
         </w:rPr>
-        <w:t xml:space="preserve">Stage 3 — Backend integration: </w:t>
+        <w:t>Stage 3 (done) — Backend integration: clone-voice-station exposes /api/transcribe and /api/speak (voice/stt.py, voice/tts.py, voice/rvc_client.py, engine/voice_engine.py); rag-legal-assistant consumes both through clone-voice-client (voice/station_client.py) via /voice/transcribe and /voice/speak.</w:t>
       </w:r>
       <w:r>
         <w:rPr>
           <w:rFonts w:hint="default" w:ascii="Times New Roman" w:hAnsi="Times New Roman" w:cs="Times New Roman"/>
           <w:sz w:val="24"/>
         </w:rPr>
-        <w:t>implement voice/stt.py, voice/tts.py, voice/rvc.py, and voice/voice_engine.py; expose /voice/transcribe and /voice/speak.</w:t>
       </w:r>
     </w:p>
     <w:p>
@@ -8790,14 +8819,13 @@
           <w:b/>
           <w:sz w:val="24"/>
         </w:rPr>
-        <w:t xml:space="preserve">Stage 4 — Frontend integration: </w:t>
+        <w:t>Stage 4 (done) — Frontend integration: a MediaRecorder-based mic button and voice-output toggle were added to rag-legal-assistant's existing chat interface.</w:t>
       </w:r>
       <w:r>
         <w:rPr>
           <w:rFonts w:hint="default" w:ascii="Times New Roman" w:hAnsi="Times New Roman" w:cs="Times New Roman"/>
           <w:sz w:val="24"/>
         </w:rPr>
-        <w:t>add MediaRecorder-based mic UI, voice-output toggle, and audio playback to the existing chat interface.</w:t>
       </w:r>
     </w:p>
     <w:p>
@@ -8814,14 +8842,13 @@
           <w:b/>
           <w:sz w:val="24"/>
         </w:rPr>
-        <w:t xml:space="preserve">Stage 5 — Evaluation &amp; write-up: </w:t>
+        <w:t>Stage 5 (remaining) — Evaluation &amp; write-up: compute the objective metrics in Section 6.1, run the MOS survey against the F5-TTS-Vietnamese-ViVoice baseline, and finalise this manuscript.</w:t>
       </w:r>
       <w:r>
         <w:rPr>
           <w:rFonts w:hint="default" w:ascii="Times New Roman" w:hAnsi="Times New Roman" w:cs="Times New Roman"/>
           <w:sz w:val="24"/>
         </w:rPr>
-        <w:t>compute objective metrics, run a 20-participant MOS survey, compare against XTTS-v2, write the thesis.</w:t>
       </w:r>
     </w:p>
     <w:p>
@@ -9032,7 +9059,7 @@
           <w:i w:val="0"/>
           <w:sz w:val="24"/>
         </w:rPr>
-        <w:t xml:space="preserve">The project is feasible. The RAG assistant is already implemented and serves as a stable substrate. Whisper, edge-TTS, and rvc-python are all open source and pip-installable. Google Colab provides free T4 GPU instances that are sufficient for training RVC v2 models of the planned size. The main technical risks are </w:t>
+        <w:t>The project has proven feasible in practice, not just in principle: PhoWhisper, edge-TTS, F5-TTS-Vietnamese-ViVoice, and RVC v2 are all open-source and pip-installable, and Google Colab's free T4 GPU instances have been sufficient for RVC training and PhoWhisper-large inference at the planned model sizes. The main technical risks are (1) end-to-end latency, addressed by thread-offloaded inference and CPU-friendly fallback model sizes; (2) acoustic quality of the training data, addressed by manual cleaning and a normalisation preprocessing step; and (3) browser audio compatibility, addressed by transcoding all uploaded audio through ffmpeg + pydub before feeding it to Whisper/PhoWhisper; a fourth risk specific to the split architecture — the Colab session going offline mid-conversation — is addressed by graceful degradation to plain TTS and local Whisper, verified in both voice/rvc_client.py and voice/stt.py.</w:t>
       </w:r>
       <w:r>
         <w:rPr>
@@ -9042,7 +9069,6 @@
           <w:sz w:val="24"/>
           <w:lang w:val="en-US"/>
         </w:rPr>
-        <w:t>one</w:t>
       </w:r>
       <w:r>
         <w:rPr>
@@ -9051,7 +9077,6 @@
           <w:i w:val="0"/>
           <w:sz w:val="24"/>
         </w:rPr>
-        <w:t xml:space="preserve"> end-to-end latency, addressed by chunked streaming and CPU-friendly model sizes, </w:t>
       </w:r>
       <w:r>
         <w:rPr>
@@ -9061,7 +9086,6 @@
           <w:sz w:val="24"/>
           <w:lang w:val="en-US"/>
         </w:rPr>
-        <w:t>two</w:t>
       </w:r>
       <w:r>
         <w:rPr>
@@ -9070,7 +9094,6 @@
           <w:i w:val="0"/>
           <w:sz w:val="24"/>
         </w:rPr>
-        <w:t xml:space="preserve"> acoustic quality of the training data, addressed by manual cleaning and a </w:t>
       </w:r>
       <w:r>
         <w:rPr>
@@ -9080,7 +9103,6 @@
           <w:sz w:val="24"/>
           <w:lang w:val="en-US"/>
         </w:rPr>
-        <w:t>normalization</w:t>
       </w:r>
       <w:r>
         <w:rPr>
@@ -9089,7 +9111,6 @@
           <w:i w:val="0"/>
           <w:sz w:val="24"/>
         </w:rPr>
-        <w:t xml:space="preserve"> </w:t>
       </w:r>
       <w:r>
         <w:rPr>
@@ -9097,7 +9118,6 @@
           <w:sz w:val="24"/>
           <w:lang w:val="en-US"/>
         </w:rPr>
-        <w:t>prepossessing</w:t>
       </w:r>
       <w:r>
         <w:rPr>
@@ -9106,7 +9126,6 @@
           <w:i w:val="0"/>
           <w:sz w:val="24"/>
         </w:rPr>
-        <w:t xml:space="preserve"> step, and </w:t>
       </w:r>
       <w:r>
         <w:rPr>
@@ -9116,7 +9135,6 @@
           <w:sz w:val="24"/>
           <w:lang w:val="en-US"/>
         </w:rPr>
-        <w:t>three</w:t>
       </w:r>
       <w:r>
         <w:rPr>
@@ -9125,157 +9143,48 @@
           <w:i w:val="0"/>
           <w:sz w:val="24"/>
         </w:rPr>
-        <w:t xml:space="preserve"> browser audio compatibility, addressed by transcoding all uploaded audio through ffmpeg + pydub before feeding it to Whisper.</w:t>
       </w:r>
     </w:p>
     <w:p>
       <w:pPr>
         <w:pStyle w:val="2"/>
-        <w:bidi w:val="0"/>
-        <w:rPr>
-          <w:rFonts w:hint="default" w:ascii="Times New Roman" w:hAnsi="Times New Roman" w:cs="Times New Roman"/>
-          <w:color w:val="auto"/>
-        </w:rPr>
-      </w:pPr>
-      <w:bookmarkStart w:id="29" w:name="_Toc16513"/>
-      <w:r>
-        <w:rPr>
-          <w:rFonts w:hint="default" w:ascii="Times New Roman" w:hAnsi="Times New Roman" w:cs="Times New Roman"/>
-          <w:color w:val="auto"/>
-        </w:rPr>
-        <w:t>5. Expected Results</w:t>
-      </w:r>
-      <w:bookmarkEnd w:id="29"/>
-    </w:p>
-    <w:p>
-      <w:pPr>
-        <w:spacing w:line="360" w:lineRule="auto"/>
-        <w:rPr>
-          <w:rFonts w:hint="default" w:ascii="Times New Roman" w:hAnsi="Times New Roman" w:cs="Times New Roman"/>
-        </w:rPr>
-      </w:pPr>
-      <w:r>
-        <w:rPr>
-          <w:rFonts w:hint="default" w:ascii="Times New Roman" w:hAnsi="Times New Roman" w:cs="Times New Roman"/>
-          <w:b w:val="0"/>
-          <w:i w:val="0"/>
-          <w:sz w:val="24"/>
-        </w:rPr>
-        <w:t xml:space="preserve">The </w:t>
-      </w:r>
-      <w:r>
-        <w:rPr>
-          <w:rFonts w:hint="default" w:ascii="Times New Roman" w:hAnsi="Times New Roman" w:cs="Times New Roman"/>
-          <w:b w:val="0"/>
-          <w:i w:val="0"/>
-          <w:sz w:val="24"/>
-          <w:lang w:val="en-US"/>
-        </w:rPr>
-        <w:t>deliverable</w:t>
-      </w:r>
-      <w:r>
-        <w:rPr>
-          <w:rFonts w:hint="default" w:ascii="Times New Roman" w:hAnsi="Times New Roman" w:cs="Times New Roman"/>
-          <w:b w:val="0"/>
-          <w:i w:val="0"/>
-          <w:sz w:val="24"/>
-        </w:rPr>
-        <w:t xml:space="preserve"> of this thesis are the following:</w:t>
-      </w:r>
-    </w:p>
-    <w:p>
-      <w:pPr>
-        <w:pStyle w:val="23"/>
-        <w:spacing w:line="312" w:lineRule="auto"/>
-        <w:rPr>
-          <w:rFonts w:hint="default" w:ascii="Times New Roman" w:hAnsi="Times New Roman" w:cs="Times New Roman"/>
-        </w:rPr>
-      </w:pPr>
-      <w:r>
-        <w:rPr>
-          <w:rFonts w:hint="default" w:ascii="Times New Roman" w:hAnsi="Times New Roman" w:cs="Times New Roman"/>
-          <w:sz w:val="24"/>
-        </w:rPr>
-        <w:t>An extended version of the existing rag-legal-assistant Flask application with new endpoints /voice/transcribe and /voice/speak, plus mic and audio-playback UI elements.</w:t>
-      </w:r>
-    </w:p>
-    <w:p>
-      <w:pPr>
-        <w:pStyle w:val="23"/>
-        <w:spacing w:line="312" w:lineRule="auto"/>
-        <w:rPr>
-          <w:rFonts w:hint="default" w:ascii="Times New Roman" w:hAnsi="Times New Roman" w:cs="Times New Roman"/>
-        </w:rPr>
-      </w:pPr>
-      <w:r>
-        <w:rPr>
-          <w:rFonts w:hint="default" w:ascii="Times New Roman" w:hAnsi="Times New Roman" w:cs="Times New Roman"/>
-          <w:sz w:val="24"/>
-        </w:rPr>
-        <w:t xml:space="preserve">A reproducible Google Colab notebook (colab/train_rvc.ipynb) that trains an RVC v2 voice model end to end, including data </w:t>
-      </w:r>
-      <w:r>
-        <w:rPr>
-          <w:rFonts w:hint="default" w:ascii="Times New Roman" w:hAnsi="Times New Roman" w:cs="Times New Roman"/>
-          <w:sz w:val="24"/>
-          <w:lang w:val="en-US"/>
-        </w:rPr>
-        <w:t>prepossessing</w:t>
-      </w:r>
-      <w:r>
-        <w:rPr>
-          <w:rFonts w:hint="default" w:ascii="Times New Roman" w:hAnsi="Times New Roman" w:cs="Times New Roman"/>
-          <w:sz w:val="24"/>
-        </w:rPr>
-        <w:t>, training, and index extraction.</w:t>
-      </w:r>
-    </w:p>
-    <w:p>
-      <w:pPr>
-        <w:pStyle w:val="23"/>
-        <w:spacing w:line="312" w:lineRule="auto"/>
-        <w:rPr>
-          <w:rFonts w:hint="default" w:ascii="Times New Roman" w:hAnsi="Times New Roman" w:cs="Times New Roman"/>
-        </w:rPr>
-      </w:pPr>
-      <w:r>
-        <w:rPr>
-          <w:rFonts w:hint="default" w:ascii="Times New Roman" w:hAnsi="Times New Roman" w:cs="Times New Roman"/>
-          <w:sz w:val="24"/>
-        </w:rPr>
-        <w:t>At least two trained RVC voice models (.pth + .index) covering one female and one male Vietnamese target speaker.</w:t>
-      </w:r>
-    </w:p>
-    <w:p>
-      <w:pPr>
-        <w:pStyle w:val="23"/>
-        <w:spacing w:line="312" w:lineRule="auto"/>
-        <w:rPr>
-          <w:rFonts w:hint="default" w:ascii="Times New Roman" w:hAnsi="Times New Roman" w:cs="Times New Roman"/>
-        </w:rPr>
-      </w:pPr>
-      <w:r>
-        <w:rPr>
-          <w:rFonts w:hint="default" w:ascii="Times New Roman" w:hAnsi="Times New Roman" w:cs="Times New Roman"/>
-          <w:sz w:val="24"/>
-        </w:rPr>
-        <w:t>A quantitative evaluation report comparing the TTS + RVC pipeline against XTTS-v2 on the same set of 30 Vietnamese legal answers.</w:t>
-      </w:r>
-    </w:p>
-    <w:p>
-      <w:pPr>
-        <w:pStyle w:val="23"/>
-        <w:spacing w:line="312" w:lineRule="auto"/>
-        <w:rPr>
-          <w:rFonts w:hint="default" w:ascii="Times New Roman" w:hAnsi="Times New Roman" w:cs="Times New Roman"/>
-        </w:rPr>
-      </w:pPr>
-      <w:r>
-        <w:rPr>
-          <w:rFonts w:hint="default" w:ascii="Times New Roman" w:hAnsi="Times New Roman" w:cs="Times New Roman"/>
-          <w:sz w:val="24"/>
-        </w:rPr>
-        <w:t>The full thesis manuscript and a short demonstration video.</w:t>
+      </w:pPr>
+      <w:r>
+        <w:t>5. Legal and Ethical Considerations</w:t>
+      </w:r>
+    </w:p>
+    <w:p>
+      <w:pPr/>
+      <w:r>
+        <w:t>Two Vietnamese legal frameworks took effect during this thesis and apply directly to a voice-cloning system: the Law on Personal Data Protection (91/2025/QH15, effective 1 January 2026) and the Law on Artificial Intelligence (134/2025/QH15, effective 1 March 2026). Both are addressed in the implementation itself, not deferred to a policy appendix, since a voice-cloning prototype that is silent on either would be difficult to defend as production-realistic.</w:t>
+      </w:r>
+    </w:p>
+    <w:p>
+      <w:pPr>
+        <w:pStyle w:val="3"/>
+      </w:pPr>
+      <w:r>
+        <w:t>5.1 Personal Data Protection (Law No. 91/2025/QH15)</w:t>
+      </w:r>
+    </w:p>
+    <w:p>
+      <w:pPr/>
+      <w:r>
+        <w:t>A user's recorded voice sample and the RVC model trained from it are biometric data — a category of sensitive personal data under the Law [13]. Three consequences follow directly in the implementation: (1) rag-legal-assistant's consent screen explicitly names the recordings as biometric data, states the sole purpose (personalised read-aloud within the app), and discloses that training samples are sent to a Google Colab instance for model training — a cross-border transfer of sensitive personal data the Law requires the data subject to be informed of; (2) every voice profile, sample, and locally cached model can be deleted on demand, satisfying the data-subject deletion right; (3) biometric data is scoped per client app and per external_user_id at the database layer, so one client's end users cannot enumerate or access another's recordings. A production deployment beyond this academic prototype would additionally need a formal Cross-Border Transfer Impact Assessment and registration with the Ministry of Public Security before sending samples to Colab — out of scope here, but flagged as a prerequisite for any real deployment.</w:t>
+      </w:r>
+    </w:p>
+    <w:p>
+      <w:pPr>
+        <w:pStyle w:val="3"/>
+      </w:pPr>
+      <w:r>
+        <w:t>5.2 AI-Generated Content Labeling (Law No. 134/2025/QH15)</w:t>
+      </w:r>
+    </w:p>
+    <w:p>
+      <w:pPr/>
+      <w:r>
+        <w:t>The Law requires that audio simulating or impersonating a real person's voice carry a voice notice at the beginning identifying it as AI-generated, plus a digital watermark [14]. clone-voice-station implements both: whenever a response is played back through an RVC-cloned voice, the output audio is prefixed with a synthesized Vietnamese disclosure clip stating that the content is AI-generated, and the exported WAV carries a provenance tag in its metadata identifying it as AI-generated/voice-converted — the same class of approach used by C2PA content credentials for images. This labeling is scoped to RVC-cloned output specifically: the builtin system voices are not modeled on any identifiable real person and fall outside the impersonation clause the requirement targets. A full production deployment would additionally require self-classifying the service's AI-system risk tier and, if medium or high risk, notifying the Ministry of Science and Technology before deployment — noted here as a governance step this academic prototype does not itself complete.</w:t>
       </w:r>
     </w:p>
     <w:p>
@@ -10393,7 +10302,7 @@
           <w:i w:val="0"/>
           <w:sz w:val="24"/>
         </w:rPr>
-        <w:t>SNR (dB) measures how loud the speech signal is relative to the noise floor introduced by the RVC re-voicing step. It is computed as SNR = 10 · log10(P_signal / P_noise), where the signal power is the RMS of the foreground speech segments and the noise power is the RMS of the leading and trailing 200 ms of silence in the same WAV. SNR below ~15 dB sounds 'hissy' to listeners; ≥ 20 dB is the threshold for studio-quality television voice-over [14] and is therefore the acceptance level for our RVC output.</w:t>
+        <w:t>SNR below ~15 dB sounds 'hissy' to listeners; this thesis adopts ≥ 20 dB, a level commonly associated with studio-quality broadcast voice-over, as the acceptance threshold for RVC output.</w:t>
       </w:r>
     </w:p>
     <w:p>
@@ -10437,7 +10346,7 @@
           <w:i w:val="0"/>
           <w:sz w:val="24"/>
         </w:rPr>
-        <w:t xml:space="preserve">Twenty native Vietnamese-speaking volunteers will rate naturalness and target-speaker similarity on a 5-point Likert scale (1 = bad, 5 = excellent), using the ITU-T P.808 protocol. Each volunteer rates 30 answer pairs (TTS + RVC vs XTTS-v2) presented blind and </w:t>
+        <w:t>Twenty native Vietnamese-speaking volunteers will rate naturalness and target-speaker similarity on a 5-point Likert scale (1 = bad, 5 = excellent), using the ITU-T P.808 protocol. Each volunteer rates 30 answer pairs (TTS + RVC vs F5-TTS-Vietnamese-ViVoice) presented blind and randomized. The 3.8 / 3.5 thresholds are this thesis's own acceptance bar, set in line with typical reported ranges for production-grade Vietnamese TTS systems.</w:t>
       </w:r>
       <w:r>
         <w:rPr>
@@ -10447,7 +10356,6 @@
           <w:sz w:val="24"/>
           <w:lang w:val="en-US"/>
         </w:rPr>
-        <w:t>randomized</w:t>
       </w:r>
       <w:r>
         <w:rPr>
@@ -10456,7 +10364,6 @@
           <w:i w:val="0"/>
           <w:sz w:val="24"/>
         </w:rPr>
-        <w:t>. The 3.8 / 3.5 thresholds reflect the lowest acceptable subjective scores reported for production-grade Vietnamese TTS systems in [15].</w:t>
       </w:r>
     </w:p>
     <w:p>
@@ -10507,7 +10414,7 @@
           <w:rFonts w:hint="default" w:ascii="Times New Roman" w:hAnsi="Times New Roman" w:cs="Times New Roman"/>
           <w:sz w:val="24"/>
         </w:rPr>
-        <w:t xml:space="preserve">T1 — Model-size selection. Whisper-tiny vs Whisper-small vs Whisper-medium are </w:t>
+        <w:t>T1 — Model-size selection. Whisper-tiny/small/medium and PhoWhisper-small/medium/large are benchmarked on the same 30-question test set; the smallest model that meets the 15% WER threshold is deployed as the default, with a smaller model as the fallback if Colab is unavailable.</w:t>
       </w:r>
       <w:r>
         <w:rPr>
@@ -10515,14 +10422,12 @@
           <w:sz w:val="24"/>
           <w:lang w:val="en-US"/>
         </w:rPr>
-        <w:t>benchmark</w:t>
       </w:r>
       <w:r>
         <w:rPr>
           <w:rFonts w:hint="default" w:ascii="Times New Roman" w:hAnsi="Times New Roman" w:cs="Times New Roman"/>
           <w:sz w:val="24"/>
         </w:rPr>
-        <w:t xml:space="preserve"> on the same 30-question test set; the smallest model that meets the 15 % WER threshold is deployed.</w:t>
       </w:r>
     </w:p>
     <w:p>
@@ -10626,7 +10531,7 @@
           <w:color w:val="000000"/>
           <w:sz w:val="28"/>
         </w:rPr>
-        <w:t>7. Expected Results</w:t>
+        <w:t>7. Expected Results and Deliverables</w:t>
       </w:r>
       <w:bookmarkEnd w:id="39"/>
     </w:p>
@@ -10643,7 +10548,7 @@
           <w:rFonts w:hint="default" w:ascii="Times New Roman" w:hAnsi="Times New Roman" w:cs="Times New Roman"/>
           <w:sz w:val="24"/>
         </w:rPr>
-        <w:t>An extended version of the rag-legal-assistant Flask application with /voice/transcribe and /voice/speak endpoints, plus mic and audio-playback UI elements.</w:t>
+        <w:t>clone-voice-station: an independent FastAPI voice service (STT via PhoWhisper/Whisper, TTS via edge-TTS/F5-TTS, RVC voice conversion) with a SQLite-backed data model, manager dashboard, and webhook notifications — implemented.</w:t>
       </w:r>
     </w:p>
     <w:p>
@@ -10659,7 +10564,7 @@
           <w:rFonts w:hint="default" w:ascii="Times New Roman" w:hAnsi="Times New Roman" w:cs="Times New Roman"/>
           <w:sz w:val="24"/>
         </w:rPr>
-        <w:t>A reproducible Google Colab notebook that trains an RVC v2 voice model end-to-end (</w:t>
+        <w:t>clone-voice-client: an installable Python SDK wrapping the station's HTTP API, so a new AI assistant can integrate the voice loop without duplicating HTTP code — implemented.</w:t>
       </w:r>
       <w:r>
         <w:rPr>
@@ -10667,14 +10572,12 @@
           <w:sz w:val="24"/>
           <w:lang w:val="en-US"/>
         </w:rPr>
-        <w:t>prepossessing</w:t>
       </w:r>
       <w:r>
         <w:rPr>
           <w:rFonts w:hint="default" w:ascii="Times New Roman" w:hAnsi="Times New Roman" w:cs="Times New Roman"/>
           <w:sz w:val="24"/>
         </w:rPr>
-        <w:t>, training, index extraction).</w:t>
       </w:r>
     </w:p>
     <w:p>
@@ -10690,7 +10593,7 @@
           <w:rFonts w:hint="default" w:ascii="Times New Roman" w:hAnsi="Times New Roman" w:cs="Times New Roman"/>
           <w:sz w:val="24"/>
         </w:rPr>
-        <w:t>A second Colab notebook that runs the RVC inference server and exposes it as a public HTTPS endpoint via cloudflared.</w:t>
+        <w:t>rag-legal-assistant: extended with mic-based question input (/voice/transcribe) and cloned-voice read-aloud (/voice/speak), consuming clone-voice-station purely through the SDK — implemented.</w:t>
       </w:r>
     </w:p>
     <w:p>
@@ -10706,7 +10609,7 @@
           <w:rFonts w:hint="default" w:ascii="Times New Roman" w:hAnsi="Times New Roman" w:cs="Times New Roman"/>
           <w:sz w:val="24"/>
         </w:rPr>
-        <w:t>At least two trained RVC voice models (.pth + .index) covering one female and one male Vietnamese speaker.</w:t>
+        <w:t>A reproducible Google Colab notebook (colab/voice_server.ipynb) that trains and serves RVC v2 voice models and PhoWhisper transcription end-to-end, exposed over HTTPS via cloudflared — implemented.</w:t>
       </w:r>
     </w:p>
     <w:p>
@@ -10722,7 +10625,7 @@
           <w:rFonts w:hint="default" w:ascii="Times New Roman" w:hAnsi="Times New Roman" w:cs="Times New Roman"/>
           <w:sz w:val="24"/>
         </w:rPr>
-        <w:t>A quantitative evaluation report covering all metrics in section</w:t>
+        <w:t>AI-generated voice disclosure and provenance watermarking on all RVC output, and a consent flow naming biometric-data processing and cross-border transfer, per Section 5 — implemented.</w:t>
       </w:r>
       <w:r>
         <w:rPr>
@@ -10730,14 +10633,12 @@
           <w:sz w:val="24"/>
           <w:lang w:val="en-US"/>
         </w:rPr>
-        <w:t xml:space="preserve"> </w:t>
       </w:r>
       <w:r>
         <w:rPr>
           <w:rFonts w:hint="default" w:ascii="Times New Roman" w:hAnsi="Times New Roman" w:cs="Times New Roman"/>
           <w:sz w:val="24"/>
         </w:rPr>
-        <w:t>6.1 and the latency-reduction techniques in section</w:t>
       </w:r>
       <w:r>
         <w:rPr>
@@ -10745,14 +10646,12 @@
           <w:sz w:val="24"/>
           <w:lang w:val="en-US"/>
         </w:rPr>
-        <w:t xml:space="preserve"> </w:t>
       </w:r>
       <w:r>
         <w:rPr>
           <w:rFonts w:hint="default" w:ascii="Times New Roman" w:hAnsi="Times New Roman" w:cs="Times New Roman"/>
           <w:sz w:val="24"/>
         </w:rPr>
-        <w:t>6.3.</w:t>
       </w:r>
     </w:p>
     <w:p>
@@ -10771,7 +10670,23 @@
           <w:rFonts w:hint="default" w:ascii="Times New Roman" w:hAnsi="Times New Roman" w:cs="Times New Roman"/>
           <w:sz w:val="24"/>
         </w:rPr>
-        <w:t>The full thesis manuscript and a short demonstration video.</w:t>
+        <w:t>At least two trained RVC voice models (.pth + .index) covering one female and one male Vietnamese speaker — remaining.</w:t>
+      </w:r>
+    </w:p>
+    <w:p>
+      <w:pPr>
+        <w:pStyle w:val="23"/>
+      </w:pPr>
+      <w:r>
+        <w:t>A quantitative evaluation report covering all metrics in Section 6.1 (WER, latency, SNR, MOS) and the latency-reduction techniques in Section 6.3, benchmarked against the F5-TTS-Vietnamese-ViVoice baseline — remaining.</w:t>
+      </w:r>
+    </w:p>
+    <w:p>
+      <w:pPr>
+        <w:pStyle w:val="23"/>
+      </w:pPr>
+      <w:r>
+        <w:t>The full thesis manuscript and a short demonstration video — remaining.</w:t>
       </w:r>
     </w:p>
     <w:p>
@@ -10927,6 +10842,42 @@
           <w:sz w:val="22"/>
         </w:rPr>
         <w:t>[8] Z. Qin et al., "OpenVoice: Versatile Instant Voice Cloning," arXiv:2312.01479, 2023.</w:t>
+      </w:r>
+    </w:p>
+    <w:p>
+      <w:pPr/>
+      <w:r>
+        <w:t>[9] Meta AI, "The Llama 3 Herd of Models," arXiv:2407.21783, 2024.</w:t>
+      </w:r>
+    </w:p>
+    <w:p>
+      <w:pPr/>
+      <w:r>
+        <w:t>[10] S. Xiao, Z. Liu, P. Zhang, and N. Muennighoff, "C-Pack: Packaged Resources To Advance General Chinese Embedding," arXiv:2309.07597, 2023.</w:t>
+      </w:r>
+    </w:p>
+    <w:p>
+      <w:pPr/>
+      <w:r>
+        <w:t>[11] hynt, "F5-TTS-Vietnamese-ViVoice," Hugging Face, 2024. https://huggingface.co/hynt/F5-TTS-Vietnamese-ViVoice</w:t>
+      </w:r>
+    </w:p>
+    <w:p>
+      <w:pPr/>
+      <w:r>
+        <w:t>[12] Y. Chen et al., "F5-TTS: A Fairytaler that Fakes Fluent and Faithful Speech with Flow Matching," arXiv:2410.06885, 2024.</w:t>
+      </w:r>
+    </w:p>
+    <w:p>
+      <w:pPr/>
+      <w:r>
+        <w:t>[13] National Assembly of Vietnam, Law on Personal Data Protection, Law No. 91/2025/QH15, 26 June 2025 (effective 1 January 2026).</w:t>
+      </w:r>
+    </w:p>
+    <w:p>
+      <w:pPr/>
+      <w:r>
+        <w:t>[14] National Assembly of Vietnam, Law on Artificial Intelligence, Law No. 134/2025/QH15, 10 December 2025 (effective 1 March 2026).</w:t>
       </w:r>
     </w:p>
     <w:sectPr>

</xml_diff>

<commit_message>
Update thesis: document the STT Lab Tier 1/2 extension
Adds a new Stage 5 (renumbering the old Stage 5 to Stage 6) in Section
4.1 and two new deliverable bullets in Section 7, describing
clone-voice-station's guest self-service STT Lab (hotword prompt-bias
Tier 1, real LoRA fine-tune of Whisper Tier 2 via Colab/local/both for
comparison) and clone-voice-client's local execution mode demonstrated
by voice-lab-example.
</commit_message>
<xml_diff>
--- a/Thesis_bao24mse23204 (1).docx
+++ b/Thesis_bao24mse23204 (1).docx
@@ -7264,7 +7264,7 @@
         </w:rPr>
         <w:drawing>
           <wp:inline distT="0" distB="0" distL="114300" distR="114300">
-            <wp:extent cx="5725795" cy="1585595"/>
+            <wp:extent cx="5730240" cy="2054632"/>
             <wp:effectExtent l="0" t="0" r="4445" b="14605"/>
             <wp:docPr id="4" name="Picture 4" descr="pipe"/>
             <wp:cNvGraphicFramePr>
@@ -7288,7 +7288,7 @@
                   <pic:spPr>
                     <a:xfrm>
                       <a:off x="0" y="0"/>
-                      <a:ext cx="5725795" cy="1585595"/>
+                      <a:ext cx="5730240" cy="2054632"/>
                     </a:xfrm>
                     <a:prstGeom prst="rect">
                       <a:avLst/>
@@ -7507,7 +7507,7 @@
         </w:rPr>
         <w:drawing>
           <wp:inline distT="0" distB="0" distL="114300" distR="114300">
-            <wp:extent cx="5730240" cy="4112260"/>
+            <wp:extent cx="5730240" cy="3692288"/>
             <wp:effectExtent l="0" t="0" r="0" b="2540"/>
             <wp:docPr id="13" name="Picture 13" descr="architecture"/>
             <wp:cNvGraphicFramePr>
@@ -7531,7 +7531,7 @@
                   <pic:spPr>
                     <a:xfrm>
                       <a:off x="0" y="0"/>
-                      <a:ext cx="5730240" cy="4112260"/>
+                      <a:ext cx="5730240" cy="3692288"/>
                     </a:xfrm>
                     <a:prstGeom prst="rect">
                       <a:avLst/>
@@ -8796,7 +8796,7 @@
           <w:b/>
           <w:sz w:val="24"/>
         </w:rPr>
-        <w:t>Stage 3 (done) — Backend integration: clone-voice-station exposes /api/transcribe and /api/speak (voice/stt.py, voice/tts.py, voice/rvc_client.py, engine/voice_engine.py); rag-legal-assistant consumes both through clone-voice-client (voice/station_client.py) via /voice/transcribe and /voice/speak.</w:t>
+        <w:t>Stage 3 (done) — Backend integration: clone-voice-station exposes /api/transcribe and /api/speak (voice/stt.py, voice/tts.py, voice/rvc_client.py, engine/voice_engine.py); rag-legal-assistant consumes both through clone-voice-client (voice/station_client.py) via /voice/transcribe and /voice/speak. A subsequent reliability fix added a GET /voice/status endpoint (backed by VoiceStationClient.is_available()) and a start_all.bat launcher, so the two-process architecture starts together and a clone-voice-station outage is surfaced to the user instead of silently returning an empty voice list.</w:t>
       </w:r>
       <w:r>
         <w:rPr>
@@ -8819,13 +8819,26 @@
           <w:b/>
           <w:sz w:val="24"/>
         </w:rPr>
-        <w:t>Stage 4 (done) — Frontend integration: a MediaRecorder-based mic button and voice-output toggle were added to rag-legal-assistant's existing chat interface.</w:t>
+        <w:t>Stage 4 (done) — Frontend integration: a MediaRecorder-based mic button and voice-output toggle were added to rag-legal-assistant's existing chat interface. The mic button was subsequently upgraded from single-shot dictation to live transcription: MediaRecorder captures audio in 500 ms chunks, and every 2.5 s the growing recording is re-sent to /voice/transcribe so the chat input updates with a running transcript while the user keeps speaking, with one final authoritative transcription performed when recording is stopped.</w:t>
       </w:r>
       <w:r>
         <w:rPr>
           <w:rFonts w:hint="default" w:ascii="Times New Roman" w:hAnsi="Times New Roman" w:cs="Times New Roman"/>
           <w:sz w:val="24"/>
         </w:rPr>
+      </w:r>
+    </w:p>
+    <w:p>
+      <w:pPr>
+        <w:pStyle w:val="23"/>
+      </w:pPr>
+      <w:r>
+        <w:rPr>
+          <w:rFonts w:ascii="Times New Roman" w:hAnsi="Times New Roman"/>
+          <w:b/>
+          <w:sz w:val="24"/>
+        </w:rPr>
+        <w:t>Stage 5 (done) — STT Lab self-serve extension: clone-voice-station gained a guest self-service page (/stt-lab) where a user registers directly — no API key, unlike the rest of the station's client-scoped API — to bias transcription toward domain vocabulary via a prompt-level hotword list (Tier 1, no training) or fine-tune a real LoRA adapter on whisper-tiny/whisper-base from uploaded (audio, transcript) pairs (Tier 2), trainable via Colab, a local GPU, or both for direct comparison; local jobs are serialized through a dedicated single-worker queue since this page has no API-key gate to bound concurrent GPU usage the way the rest of the station's endpoints do. clone-voice-client correspondingly gained a local execution mode (transcribe_local()) so a host application can run Whisper — plain or LoRA-adapted — inside its own process instead of depending on a reachable clone-voice-station instance, demonstrated end-to-end by a new reference application, voice-lab-example.</w:t>
       </w:r>
     </w:p>
     <w:p>
@@ -8842,7 +8855,7 @@
           <w:b/>
           <w:sz w:val="24"/>
         </w:rPr>
-        <w:t>Stage 5 (remaining) — Evaluation &amp; write-up: compute the objective metrics in Section 6.1, run the MOS survey against the F5-TTS-Vietnamese-ViVoice baseline, and finalise this manuscript.</w:t>
+        <w:t>Stage 6 (remaining) — Evaluation &amp; write-up: compute the objective metrics in Section 6.1, run the MOS survey against the F5-TTS-Vietnamese-ViVoice baseline, and finalise this manuscript.</w:t>
       </w:r>
       <w:r>
         <w:rPr>
@@ -10652,6 +10665,30 @@
           <w:rFonts w:hint="default" w:ascii="Times New Roman" w:hAnsi="Times New Roman" w:cs="Times New Roman"/>
           <w:sz w:val="24"/>
         </w:rPr>
+      </w:r>
+    </w:p>
+    <w:p>
+      <w:pPr>
+        <w:pStyle w:val="23"/>
+      </w:pPr>
+      <w:r>
+        <w:rPr>
+          <w:rFonts w:ascii="Times New Roman" w:hAnsi="Times New Roman"/>
+          <w:sz w:val="24"/>
+        </w:rPr>
+        <w:t>STT Lab: a guest self-service page on clone-voice-station for prompt-level hotword bias (Tier 1) and real LoRA fine-tuning of Whisper on whisper-tiny/whisper-base (Tier 2), trainable via Colab or a local GPU with explicit backend selection for direct comparison — implemented.</w:t>
+      </w:r>
+    </w:p>
+    <w:p>
+      <w:pPr>
+        <w:pStyle w:val="23"/>
+      </w:pPr>
+      <w:r>
+        <w:rPr>
+          <w:rFonts w:ascii="Times New Roman" w:hAnsi="Times New Roman"/>
+          <w:sz w:val="24"/>
+        </w:rPr>
+        <w:t>clone-voice-client local execution mode and the voice-lab-example reference application, demonstrating Whisper (optionally LoRA-adapted) running inside a host application's own process instead of depending on a network call to clone-voice-station — implemented.</w:t>
       </w:r>
     </w:p>
     <w:p>

</xml_diff>

<commit_message>
Fix live-transcribe races and unbounded resend; note voice-lab-example /compare in thesis
- static/script.js: tag every live-tick/final-stop transcribe request with a
  per-recording sequence number so a late-arriving, superseded response can
  no longer clobber fresher text (the same trailing-tick-vs-final-stop race
  fixed in voice-lab-example's compare.js). Cap each live tick to the most
  recent ~7s of audio (header chunk + windowed tail) instead of resending
  the whole growing recording every 2.5s.
- Thesis: note voice-lab-example's new /compare view under Stage 5 (Section
  4.1) and cross-reference it from the T2 latency-reduction technique
  (Section 6.3) as the empirical instrument for the local-vs-offloaded
  latency tradeoff.

Co-Authored-By: Claude Sonnet 5 <noreply@anthropic.com>
</commit_message>
<xml_diff>
--- a/Thesis_bao24mse23204 (1).docx
+++ b/Thesis_bao24mse23204 (1).docx
@@ -8838,7 +8838,7 @@
           <w:b/>
           <w:sz w:val="24"/>
         </w:rPr>
-        <w:t>Stage 5 (done) — STT Lab self-serve extension: clone-voice-station gained a guest self-service page (/stt-lab) where a user registers directly — no API key, unlike the rest of the station's client-scoped API — to bias transcription toward domain vocabulary via a prompt-level hotword list (Tier 1, no training) or fine-tune a real LoRA adapter on whisper-tiny/whisper-base from uploaded (audio, transcript) pairs (Tier 2), trainable via Colab, a local GPU, or both for direct comparison; local jobs are serialized through a dedicated single-worker queue since this page has no API-key gate to bound concurrent GPU usage the way the rest of the station's endpoints do. clone-voice-client correspondingly gained a local execution mode (transcribe_local()) so a host application can run Whisper — plain or LoRA-adapted — inside its own process instead of depending on a reachable clone-voice-station instance, demonstrated end-to-end by a new reference application, voice-lab-example.</w:t>
+        <w:t>Stage 5 (done) — STT Lab self-serve extension: clone-voice-station gained a guest self-service page (/stt-lab) where a user registers directly — no API key, unlike the rest of the station's client-scoped API — to bias transcription toward domain vocabulary via a prompt-level hotword list (Tier 1, no training) or fine-tune a real LoRA adapter on whisper-tiny/whisper-base from uploaded (audio, transcript) pairs (Tier 2), trainable via Colab, a local GPU, or both for direct comparison; local jobs are serialized through a dedicated single-worker queue since this page has no API-key gate to bound concurrent GPU usage the way the rest of the station's endpoints do. clone-voice-client correspondingly gained a local execution mode (transcribe_local()) so a host application can run Whisper — plain or LoRA-adapted — inside its own process instead of depending on a reachable clone-voice-station instance, demonstrated end-to-end by a new reference application, voice-lab-example. A subsequent extension to voice-lab-example added a side-by-side comparison view (/compare) that records a single utterance and transcribes it through both paths concurrently — in-process via transcribe_local() and over HTTP to clone-voice-station via transcribe() — timing each independently with performance.now() and logging per-round latency, giving an empirical instrument for the local-vs-offloaded latency tradeoff discussed under T2 in Section 6.3.</w:t>
       </w:r>
     </w:p>
     <w:p>
@@ -10456,7 +10456,7 @@
           <w:rFonts w:hint="default" w:ascii="Times New Roman" w:hAnsi="Times New Roman" w:cs="Times New Roman"/>
           <w:sz w:val="24"/>
         </w:rPr>
-        <w:t>T2 — Inference-server offloading. RVC inference is moved off the local Python 3.12 host onto a Colab T4 GPU exposed via a cloudflared tunnel; the saved time on RVC offsets the added network round-trip.</w:t>
+        <w:t>T2 — Inference-server offloading. RVC inference is moved off the local Python 3.12 host onto a Colab T4 GPU exposed via a cloudflared tunnel; the saved time on RVC offsets the added network round-trip. Empirical numbers for this tradeoff are collected via voice-lab-example’s /compare view (Section 4.1, Stage 5), which times the local and offloaded paths independently on the same utterance.</w:t>
       </w:r>
     </w:p>
     <w:p>

</xml_diff>

<commit_message>
Document STT Lab Tier 2 acceptance-gate findings in thesis + defense deck
Section 4.1 (Stage 5 continuation) and a new defense slide describe the
three-gate validation pipeline built for clone-voice-station's self-serve
LoRA fine-tuning feature: a naive always-ship-last-epoch policy measurably
worsened recognition on real data; the first held-out-split fix was itself
found double-dipping (same split picked the epoch and judged accept/reject);
splitting into a disjoint early-stopping set and final-gate set fixed that
statistical bug but not the deeper one (both sets share the guest's own
upload batch); a fixed general-Vietnamese benchmark disjoint from any
guest's data closes that gap and has already caught a real case the earlier
gates missed. Reframes the section's claim: not yet a demonstrated quality
improvement over base Whisper, but a fine-tuning pipeline provably safe to
expose on a public, no-API-key-gated page.

Co-Authored-By: Claude Sonnet 5 <noreply@anthropic.com>
</commit_message>
<xml_diff>
--- a/Thesis_bao24mse23204 (1).docx
+++ b/Thesis_bao24mse23204 (1).docx
@@ -8855,6 +8855,29 @@
           <w:b/>
           <w:sz w:val="24"/>
         </w:rPr>
+        <w:t>Subsequent to Stage 5, the guest-facing Tier 2 acceptance criterion was found to have failed in practice and was revised twice. A naive policy of always shipping the last training epoch let a 458-sample medical-consultation import measurably worsen recognition — 62.8% WER against the untrained base model’s own 32.0% on the same held-out audio — so a validation gate was added that holds out part of every upload, scores the untrained base model on it as the bar to beat, and rejects any adapter whose best epoch does not clear that bar. This first gate was itself found to be biased: because the same held-out split both selected the best epoch and judged accept/reject, an adapter it accepted as 9–15 percentage points better than base on that split still lost by 20–27 percentage points on a genuinely independent 30-file evaluation set drawn from the same source dataset’s own test split, confirmed twice at different sample sizes and LoRA ranks. The held-out portion was consequently split into two disjoint sets — an early-stopping set used only to pick the best epoch, and a separate final-gate set, scored once, that had no influence over which epoch was selected — removing the double-dipping bias, though this alone proved insufficient: an adapter cleared by neither gate as overfit still lost by a comparable margin on the same independent set, because both held-out sets remain drawn from one guest’s one upload batch and therefore share its recording session, speaker, and domain characteristics regardless of how carefully they are split. A third, structurally independent check was added on top of both: every adapter, regardless of domain, is now also scored against a fixed 500-clip benchmark of general spontaneous Vietnamese speech (a slice of doof-ferb/vlsp2020_vinai_100h on Hugging Face, downloaded once and never touched by any guest’s own training data) and rejected if it does not also beat the untrained base model on that benchmark. This third gate has already been confirmed to catch a case the first two could not: a 60-sample medical-domain adapter cleared the domain-specific gate (52.0% vs. 60.2% base WER on its own held-out split) but was correctly rejected by the general-benchmark gate (47.6% vs. 44.4% base WER), indicating the adapter had overfit its narrow training domain at the expense of general Vietnamese recognition. Across every configuration tested to date — 60 to 250 training samples, LoRA rank 8 or 16 — no Tier 2 adapter has yet beaten the base model on genuinely independent domain data, so the practical contribution of this line of work to date is not a demonstrated quality improvement but a three-gate acceptance pipeline that is safe to expose on a public, no-API-key-gated page precisely because it cannot ship a regression, whether or not the underlying fine-tuning approach helps.</w:t>
+      </w:r>
+      <w:r>
+        <w:rPr>
+          <w:rFonts w:hint="default" w:ascii="Times New Roman" w:hAnsi="Times New Roman" w:cs="Times New Roman"/>
+          <w:sz w:val="24"/>
+        </w:rPr>
+      </w:r>
+    </w:p>
+    <w:p>
+      <w:pPr>
+        <w:pStyle w:val="23"/>
+        <w:spacing w:line="312" w:lineRule="auto"/>
+        <w:rPr>
+          <w:rFonts w:hint="default" w:ascii="Times New Roman" w:hAnsi="Times New Roman" w:cs="Times New Roman"/>
+        </w:rPr>
+      </w:pPr>
+      <w:r>
+        <w:rPr>
+          <w:rFonts w:hint="default" w:ascii="Times New Roman" w:hAnsi="Times New Roman" w:cs="Times New Roman"/>
+          <w:b/>
+          <w:sz w:val="24"/>
+        </w:rPr>
         <w:t>Stage 6 (remaining) — Evaluation &amp; write-up: compute the objective metrics in Section 6.1, run the MOS survey against the F5-TTS-Vietnamese-ViVoice baseline, and finalise this manuscript.</w:t>
       </w:r>
       <w:r>

</xml_diff>

<commit_message>
Add Section 6.4: preliminary pilot results from live Colab testing
First real numbers against the running service, ahead of the formal 30-
question evaluation in Section 6.1: ASR (PhoWhisper-large 11.7% WER vs
Whisper-small fallback 21.2% on a single medical-domain sample, under the
<=15% threshold but not yet the legal-domain benchmark), F5-TTS baseline
(functional, with a reference-clip-duration sensitivity discovered and
documented for the MOS study), and RVC v2 training (blocked by an upstream
breaking change in RVC-Project's own repo, tracked separately from this
thesis's own defects).

Co-Authored-By: Claude Sonnet 5 <noreply@anthropic.com>
</commit_message>
<xml_diff>
--- a/Thesis_bao24mse23204 (1).docx
+++ b/Thesis_bao24mse23204 (1).docx
@@ -10555,6 +10555,75 @@
     </w:p>
     <w:p>
       <w:pPr>
+        <w:pStyle w:val="3"/>
+        <w:rPr>
+          <w:rFonts w:hint="default" w:ascii="Times New Roman" w:hAnsi="Times New Roman" w:cs="Times New Roman"/>
+        </w:rPr>
+      </w:pPr>
+      <w:bookmarkStart w:id="33" w:name="_Toc2665"/>
+      <w:r>
+        <w:rPr>
+          <w:rFonts w:hint="default" w:ascii="Times New Roman" w:hAnsi="Times New Roman" w:cs="Times New Roman"/>
+          <w:color w:val="000000"/>
+          <w:sz w:val="24"/>
+        </w:rPr>
+        <w:t>6.4 Preliminary Pilot Results</w:t>
+      </w:r>
+      <w:bookmarkEnd w:id="33"/>
+    </w:p>
+    <w:p>
+      <w:pPr>
+        <w:spacing w:line="360" w:lineRule="auto"/>
+        <w:rPr>
+          <w:rFonts w:hint="default" w:ascii="Times New Roman" w:hAnsi="Times New Roman" w:cs="Times New Roman"/>
+        </w:rPr>
+      </w:pPr>
+      <w:r>
+        <w:rPr>
+          <w:rFonts w:hint="default" w:ascii="Times New Roman" w:hAnsi="Times New Roman" w:cs="Times New Roman"/>
+          <w:b w:val="0"/>
+          <w:i w:val="0"/>
+          <w:sz w:val="24"/>
+        </w:rPr>
+        <w:t>A first end-to-end pilot pass against the live Colab-hosted service, run outside the formal 30-question legal test set of Section 6.1, produced the following results. ASR: on a single held-out medical-domain utterance (137 reference words, chosen only because a suitable reference transcript was already on hand, not because it represents the legal domain this thesis targets), PhoWhisper-large via the Colab endpoint scored 11.7% WER against the local Whisper-small CPU fallback’s 21.2% on the same audio — encouragingly under the ≤15% threshold in Table 4, though a single non-legal sample cannot yet stand in for the formal evaluation. Latency for the same request was 18.68s remote versus roughly 8.4s local, the accuracy/latency trade-off technique T2 in Section 6.3 already anticipates.</w:t>
+      </w:r>
+    </w:p>
+    <w:p>
+      <w:pPr>
+        <w:spacing w:line="360" w:lineRule="auto"/>
+        <w:rPr>
+          <w:rFonts w:hint="default" w:ascii="Times New Roman" w:hAnsi="Times New Roman" w:cs="Times New Roman"/>
+        </w:rPr>
+      </w:pPr>
+      <w:r>
+        <w:rPr>
+          <w:rFonts w:hint="default" w:ascii="Times New Roman" w:hAnsi="Times New Roman" w:cs="Times New Roman"/>
+          <w:b w:val="0"/>
+          <w:i w:val="0"/>
+          <w:sz w:val="24"/>
+        </w:rPr>
+        <w:t>TTS baseline: the F5-TTS-Vietnamese-ViVoice endpoint (/baseline/f5tts) was exercised successfully end to end, but exposed a methodological sensitivity worth recording ahead of the formal MOS study — a 20.6s reference clip produced audibly compressed, unnaturally fast output (2.01s of generated audio for a 13-word sentence, ~6.5 words/s) while a clean 7.0s reference with an exactly matching transcript produced a more plausible 3.82s (~3.4 words/s) for the identical generated text. This confirms the reference clip should be curated to the ~6–10s length the model’s own documentation recommends rather than reused from arbitrary longer source audio.</w:t>
+      </w:r>
+    </w:p>
+    <w:p>
+      <w:pPr>
+        <w:spacing w:line="360" w:lineRule="auto"/>
+        <w:rPr>
+          <w:rFonts w:hint="default" w:ascii="Times New Roman" w:hAnsi="Times New Roman" w:cs="Times New Roman"/>
+        </w:rPr>
+      </w:pPr>
+      <w:r>
+        <w:rPr>
+          <w:rFonts w:hint="default" w:ascii="Times New Roman" w:hAnsi="Times New Roman" w:cs="Times New Roman"/>
+          <w:b w:val="0"/>
+          <w:i w:val="0"/>
+          <w:sz w:val="24"/>
+        </w:rPr>
+        <w:t>RVC v2 training: a first full train-and-convert pass was attempted against the live service and did not complete — preprocessing failed because RVC-Project’s own upstream repository has, since this notebook was first written, removed the standalone CLI scripts (trainset_preprocess_pipeline_print.py, extract_f0_print.py, extract_feature_print.py) the training pipeline shells out to, replacing them with an internal Python API not yet ported to. This is a third-party breaking change external to this thesis’s own code, distinct from the software defects described in Section 4.1’s Stage 5 note; a rewrite of the training pipeline against the current upstream API is in progress and tracked as a remaining item alongside Section 7’s trained-model deliverable.</w:t>
+      </w:r>
+    </w:p>
+    <w:p>
+      <w:pPr>
         <w:pStyle w:val="2"/>
         <w:rPr>
           <w:rFonts w:hint="default" w:ascii="Times New Roman" w:hAnsi="Times New Roman" w:cs="Times New Roman"/>

</xml_diff>